<commit_message>
Update docx with architecture flow details
</commit_message>
<xml_diff>
--- a/PROJECT_DOCUMENTATION.docx
+++ b/PROJECT_DOCUMENTATION.docx
@@ -335,34 +335,76 @@
     </w:p>
     <w:p>
       <w:pPr>
-        <w:pStyle w:val="ListNumber"/>
+        <w:pStyle w:val="ListBullet"/>
       </w:pPr>
       <w:r>
-        <w:t>User Authentication: User logs in via Clerk on the React frontend.</w:t>
+        <w:t>[Architecture Image Generation Failed - See textual flowchart below]</w:t>
       </w:r>
     </w:p>
     <w:p>
       <w:pPr>
-        <w:pStyle w:val="ListNumber"/>
+        <w:pStyle w:val="Heading3"/>
       </w:pPr>
       <w:r>
-        <w:t>Template Registration: User uploads blank_form.jpg. FastAPI receives the image. preprocess_service deskews the image. OpenCV detects horizontal/vertical lines to build a structural graph of input regions. The detected fields and template image are saved to the database and S3.</w:t>
+        <w:t>Template Registration (Pass 1)</w:t>
+      </w:r>
+    </w:p>
+    <w:p>
+      <w:r>
+        <w:t>1. The user uploads a blank document from the Frontend.</w:t>
+      </w:r>
+    </w:p>
+    <w:p>
+      <w:r>
+        <w:t>2. The Template Router sends the image to the Computer Vision Engine.</w:t>
+      </w:r>
+    </w:p>
+    <w:p>
+      <w:r>
+        <w:t>3. The image is deskewed, and OpenCV algorithms (Canny/Hough) structurally detect lines, checkboxes, and tables.</w:t>
+      </w:r>
+    </w:p>
+    <w:p>
+      <w:r>
+        <w:t>4. The exact coordinates and baseline geometry are saved in the Database, and the master image is saved in Blob Storage.</w:t>
       </w:r>
     </w:p>
     <w:p>
       <w:pPr>
-        <w:pStyle w:val="ListNumber"/>
+        <w:pStyle w:val="Heading3"/>
       </w:pPr>
       <w:r>
-        <w:t>Data Extraction: User uploads filled_form.jpg and specifies the Template ID. FastAPI loads the master template image. OpenCV calculates the homography matrix between the filled image and the template image. The filled image is warped to exactly match the template's coordinate system. PaddleOCR extracts text from the document. The system intersects the OCR bounding boxes with the template's known field coordinates to map values to labels.</w:t>
+        <w:t>Extraction &amp; Batch Queue (Pass 2)</w:t>
       </w:r>
     </w:p>
     <w:p>
-      <w:pPr>
-        <w:pStyle w:val="ListNumber"/>
-      </w:pPr>
       <w:r>
-        <w:t>Results Delivery: The structured JSON data is returned to the frontend and persisted in the database.</w:t>
+        <w:t>1. The user selects a Template and uploads multiple filled documents.</w:t>
+      </w:r>
+    </w:p>
+    <w:p>
+      <w:r>
+        <w:t>2. The Batch Router immediately accepts the request and places all 100 documents into an in-memory Asyncio Queue.</w:t>
+      </w:r>
+    </w:p>
+    <w:p>
+      <w:r>
+        <w:t>3. A pool of Background Workers constantly pulls jobs from the Queue. This prevents the main API thread from blocking, allowing the server to handle thousands of requests without timing out.</w:t>
+      </w:r>
+    </w:p>
+    <w:p>
+      <w:r>
+        <w:t>4. Each worker fetches the master template from storage, and uses feature matching (ORB/SIFT) to Warp &amp; Align the filled document perfectly over the template.</w:t>
+      </w:r>
+    </w:p>
+    <w:p>
+      <w:r>
+        <w:t>5. The worker runs PaddleOCR and simply intersects the text boundaries with the known field boundaries.</w:t>
+      </w:r>
+    </w:p>
+    <w:p>
+      <w:r>
+        <w:t>6. The resulting Key-Value pairs are saved, and the Frontend polls the backend for progress updates.</w:t>
       </w:r>
     </w:p>
     <w:p>

</xml_diff>